<commit_message>
more small UIUX changes
</commit_message>
<xml_diff>
--- a/backend/blank/blank.docx
+++ b/backend/blank/blank.docx
@@ -223,7 +223,7 @@
         <w:rFonts w:asciiTheme="minorHAnsi" w:eastAsiaTheme="minorEastAsia" w:hAnsiTheme="minorHAnsi" w:cstheme="minorBidi"/>
         <w:sz w:val="22"/>
         <w:szCs w:val="22"/>
-        <w:lang w:val="en-US" w:eastAsia="en-US" w:bidi="ar-SA"/>
+        <w:lang w:val="de-DE" w:eastAsia="de-DE" w:bidi="ar-SA"/>
       </w:rPr>
     </w:rPrDefault>
     <w:pPrDefault>
@@ -12069,7 +12069,7 @@
         <w:rFonts w:asciiTheme="minorHAnsi" w:eastAsiaTheme="minorEastAsia" w:hAnsiTheme="minorHAnsi" w:cstheme="minorBidi"/>
         <w:sz w:val="22"/>
         <w:szCs w:val="22"/>
-        <w:lang w:val="en-US" w:eastAsia="en-US" w:bidi="ar-SA"/>
+        <w:lang w:val="de-DE" w:eastAsia="de-DE" w:bidi="ar-SA"/>
       </w:rPr>
     </w:rPrDefault>
     <w:pPrDefault>

</xml_diff>